<commit_message>
Add one-click Docker Desktop setup for Windows
</commit_message>
<xml_diff>
--- a/docs/guides/TestPilot_1C_Windows_Guide.docx
+++ b/docs/guides/TestPilot_1C_Windows_Guide.docx
@@ -20,7 +20,7 @@
         <w:pStyle w:val="Subtitle"/>
       </w:pPr>
       <w:r>
-        <w:t>Установка на Windows,</w:t>
+        <w:t>Запуск в Docker,</w:t>
         <w:br/>
         <w:t>использование и демонстрация</w:t>
       </w:r>
@@ -40,12 +40,12 @@
         <w:rPr>
           <w:b/>
         </w:rPr>
-        <w:t>PowerShell · Python 3.12 · Docker Desktop · Playwright</w:t>
+        <w:t>Windows · Docker Desktop · Compose · Playwright</w:t>
       </w:r>
     </w:p>
     <w:p>
       <w:r>
-        <w:t>Версия руководства: 16 октября 2026 года</w:t>
+        <w:t>Версия руководства: 23 октября 2026 года</w:t>
       </w:r>
     </w:p>
     <w:p>
@@ -68,7 +68,7 @@
         <w:shd w:fill="FFF3D6"/>
       </w:pPr>
       <w:r>
-        <w:t>Для показа доступен полный процесс на учебном стенде. Живая 1С/OData и автоматический разбор бинарных выгрузок пока не подключены. Полная установка на реальном Windows ещё не проверена.</w:t>
+        <w:t>Все процессы запускаются в Docker. Нужна только установка Docker Desktop. Живая 1С/OData и разбор бинарных выгрузок пока не подключены.</w:t>
       </w:r>
     </w:p>
     <w:p>
@@ -98,7 +98,7 @@
           <w:rPr>
             <w:color w:val="2457B7"/>
           </w:rPr>
-          <w:t>1. Что понадобится</w:t>
+          <w:t>1. Установите Docker Desktop</w:t>
         </w:r>
       </w:hyperlink>
     </w:p>
@@ -111,7 +111,7 @@
           <w:rPr>
             <w:color w:val="2457B7"/>
           </w:rPr>
-          <w:t>2. Установка Python</w:t>
+          <w:t>2. Скачайте проект</w:t>
         </w:r>
       </w:hyperlink>
     </w:p>
@@ -124,7 +124,7 @@
           <w:rPr>
             <w:color w:val="2457B7"/>
           </w:rPr>
-          <w:t>3. Установка Git</w:t>
+          <w:t>3. Запустите TestPilot</w:t>
         </w:r>
       </w:hyperlink>
     </w:p>
@@ -137,7 +137,7 @@
           <w:rPr>
             <w:color w:val="2457B7"/>
           </w:rPr>
-          <w:t>4. Установка и проверка Docker Desktop</w:t>
+          <w:t>4. Что происходит при запуске</w:t>
         </w:r>
       </w:hyperlink>
     </w:p>
@@ -150,7 +150,7 @@
           <w:rPr>
             <w:color w:val="2457B7"/>
           </w:rPr>
-          <w:t>5. Скачивание проекта</w:t>
+          <w:t>5. Первый вход</w:t>
         </w:r>
       </w:hyperlink>
     </w:p>
@@ -163,7 +163,7 @@
           <w:rPr>
             <w:color w:val="2457B7"/>
           </w:rPr>
-          <w:t>6. Установка зависимостей проекта</w:t>
+          <w:t>6. Работа в интерфейсе</w:t>
         </w:r>
       </w:hyperlink>
     </w:p>
@@ -176,7 +176,7 @@
           <w:rPr>
             <w:color w:val="2457B7"/>
           </w:rPr>
-          <w:t>7. Первый запуск сервиса</w:t>
+          <w:t>7. Демонстрация на 7–10 минут</w:t>
         </w:r>
       </w:hyperlink>
     </w:p>
@@ -189,7 +189,7 @@
           <w:rPr>
             <w:color w:val="2457B7"/>
           </w:rPr>
-          <w:t>8. Пароль и вход в сервис</w:t>
+          <w:t>8. Нейросеть — необязательная настройка</w:t>
         </w:r>
       </w:hyperlink>
     </w:p>
@@ -202,7 +202,7 @@
           <w:rPr>
             <w:color w:val="2457B7"/>
           </w:rPr>
-          <w:t>9. Проверка установки</w:t>
+          <w:t>9. Остановка и повторный запуск</w:t>
         </w:r>
       </w:hyperlink>
     </w:p>
@@ -215,7 +215,7 @@
           <w:rPr>
             <w:color w:val="2457B7"/>
           </w:rPr>
-          <w:t>10. Использование сервиса</w:t>
+          <w:t>10. Обновление проекта</w:t>
         </w:r>
       </w:hyperlink>
     </w:p>
@@ -228,7 +228,7 @@
           <w:rPr>
             <w:color w:val="2457B7"/>
           </w:rPr>
-          <w:t>11. Демонстрация на 7–10 минут</w:t>
+          <w:t>11. Устранение ошибок</w:t>
         </w:r>
       </w:hyperlink>
     </w:p>
@@ -241,7 +241,7 @@
           <w:rPr>
             <w:color w:val="2457B7"/>
           </w:rPr>
-          <w:t>12. Настройка нейросети — необязательно</w:t>
+          <w:t>Контрольный список перед передачей или показом</w:t>
         </w:r>
       </w:hyperlink>
     </w:p>
@@ -250,58 +250,6 @@
         <w:spacing w:after="120"/>
       </w:pPr>
       <w:hyperlink w:anchor="section_12">
-        <w:r>
-          <w:rPr>
-            <w:color w:val="2457B7"/>
-          </w:rPr>
-          <w:t>13. Остановка и следующий запуск</w:t>
-        </w:r>
-      </w:hyperlink>
-    </w:p>
-    <w:p>
-      <w:pPr>
-        <w:spacing w:after="120"/>
-      </w:pPr>
-      <w:hyperlink w:anchor="section_13">
-        <w:r>
-          <w:rPr>
-            <w:color w:val="2457B7"/>
-          </w:rPr>
-          <w:t>14. Обновление проекта</w:t>
-        </w:r>
-      </w:hyperlink>
-    </w:p>
-    <w:p>
-      <w:pPr>
-        <w:spacing w:after="120"/>
-      </w:pPr>
-      <w:hyperlink w:anchor="section_14">
-        <w:r>
-          <w:rPr>
-            <w:color w:val="2457B7"/>
-          </w:rPr>
-          <w:t>15. Устранение ошибок и обращение за помощью</w:t>
-        </w:r>
-      </w:hyperlink>
-    </w:p>
-    <w:p>
-      <w:pPr>
-        <w:spacing w:after="120"/>
-      </w:pPr>
-      <w:hyperlink w:anchor="section_15">
-        <w:r>
-          <w:rPr>
-            <w:color w:val="2457B7"/>
-          </w:rPr>
-          <w:t>Контрольный список перед передачей или показом</w:t>
-        </w:r>
-      </w:hyperlink>
-    </w:p>
-    <w:p>
-      <w:pPr>
-        <w:spacing w:after="120"/>
-      </w:pPr>
-      <w:hyperlink w:anchor="section_16">
         <w:r>
           <w:rPr>
             <w:color w:val="2457B7"/>
@@ -321,109 +269,23 @@
         <w:pStyle w:val="Heading1"/>
       </w:pPr>
       <w:r>
-        <w:t>1. Что понадобится</w:t>
+        <w:t>1. Установите Docker Desktop</w:t>
       </w:r>
       <w:bookmarkEnd w:id="0"/>
-    </w:p>
-    <w:p>
-      <w:r>
-        <w:t>Инструкция рассчитана на Windows 10/11 x64. Приложения и Playwright запускаются непосредственно в Windows через PowerShell. PostgreSQL работает в Docker Desktop. Docker может использовать WSL2 внутри, но открывать Ubuntu и устанавливать в ней проект не требуется.</w:t>
-      </w:r>
-    </w:p>
-    <w:p>
-      <w:r>
-        <w:t>Понадобятся:</w:t>
-      </w:r>
-    </w:p>
-    <w:p>
-      <w:pPr>
-        <w:pStyle w:val="ListBullet"/>
-      </w:pPr>
-      <w:r>
-        <w:t>компьютер с Windows 10/11 x64;</w:t>
-      </w:r>
-    </w:p>
-    <w:p>
-      <w:pPr>
-        <w:pStyle w:val="ListBullet"/>
-      </w:pPr>
-      <w:r>
-        <w:t>интернет для первой установки;</w:t>
-      </w:r>
-    </w:p>
-    <w:p>
-      <w:pPr>
-        <w:pStyle w:val="ListBullet"/>
-      </w:pPr>
-      <w:r>
-        <w:t>права администратора для установки системных программ;</w:t>
-      </w:r>
-    </w:p>
-    <w:p>
-      <w:pPr>
-        <w:pStyle w:val="ListBullet"/>
-      </w:pPr>
-      <w:r>
-        <w:t>Python 3.12 x64 с Python Launcher;</w:t>
-      </w:r>
-    </w:p>
-    <w:p>
-      <w:pPr>
-        <w:pStyle w:val="ListBullet"/>
-      </w:pPr>
-      <w:r>
-        <w:t>Git;</w:t>
-      </w:r>
-    </w:p>
-    <w:p>
-      <w:pPr>
-        <w:pStyle w:val="ListBullet"/>
-      </w:pPr>
-      <w:r>
-        <w:t>Docker Desktop с Compose v2 и Linux containers;</w:t>
-      </w:r>
-    </w:p>
-    <w:p>
-      <w:pPr>
-        <w:pStyle w:val="ListBullet"/>
-      </w:pPr>
-      <w:r>
-        <w:t>PowerShell 5.1 или 7 и обычный браузер.</w:t>
-      </w:r>
-    </w:p>
-    <w:p>
-      <w:r>
-        <w:t>Совместимость Docker Desktop с конкретной сборкой Windows проверяйте по его актуальным требованиям. Системные программы устанавливаются один раз. Сам проект обычно запускается без прав администратора.</w:t>
-      </w:r>
-    </w:p>
-    <w:p>
-      <w:r>
-        <w:t>Все команды ниже, кроме явно указанных исключений, выполняются в PowerShell. Строки вида PS C:\...&gt; показывают приглашение терминала — вводить их не нужно. Копируйте только команды из блоков.</w:t>
-      </w:r>
-    </w:p>
-    <w:p>
-      <w:bookmarkStart w:id="1" w:name="section_1"/>
-      <w:pPr>
-        <w:pStyle w:val="Heading1"/>
-      </w:pPr>
-      <w:r>
-        <w:t>2. Установка Python</w:t>
-      </w:r>
-      <w:bookmarkEnd w:id="1"/>
     </w:p>
     <w:p>
       <w:pPr>
         <w:pStyle w:val="ListParagraph"/>
       </w:pPr>
       <w:r>
-        <w:t xml:space="preserve">1. Откройте официальный сайт: </w:t>
+        <w:t xml:space="preserve">1. Перейдите на официальный сайт: </w:t>
       </w:r>
       <w:hyperlink r:id="rId12">
         <w:r>
           <w:rPr>
             <w:color w:val="2457B7"/>
           </w:rPr>
-          <w:t>https://www.python.org/downloads/windows/</w:t>
+          <w:t>https://docs.docker.com/desktop/setup/install/windows-install/</w:t>
         </w:r>
       </w:hyperlink>
       <w:r/>
@@ -433,7 +295,7 @@
         <w:pStyle w:val="ListParagraph"/>
       </w:pPr>
       <w:r>
-        <w:t>2. Скачайте установщик Python 3.12 для Windows x64.</w:t>
+        <w:t>2. Установите Docker Desktop. Примите условия лицензии и выберите рекомендованный WSL2 backend.</w:t>
       </w:r>
     </w:p>
     <w:p>
@@ -441,7 +303,7 @@
         <w:pStyle w:val="ListParagraph"/>
       </w:pPr>
       <w:r>
-        <w:t>3. Запустите установщик. Включите Python Launcher и Add python.exe to PATH, если эти пункты предлагаются.</w:t>
+        <w:t>3. Перезагрузите компьютер, если установщик попросит.</w:t>
       </w:r>
     </w:p>
     <w:p>
@@ -449,7 +311,7 @@
         <w:pStyle w:val="ListParagraph"/>
       </w:pPr>
       <w:r>
-        <w:t>4. Завершите установку.</w:t>
+        <w:t>4. Запустите Docker Desktop через меню «Пуск» и дождитесь, пока движок будет готов.</w:t>
       </w:r>
     </w:p>
     <w:p>
@@ -457,7 +319,83 @@
         <w:pStyle w:val="ListParagraph"/>
       </w:pPr>
       <w:r>
-        <w:t>5. Откройте новое окно PowerShell через меню «Пуск» и выполните проверку.</w:t>
+        <w:t>5. Убедитесь, что выбран режим **Linux containers**. В меню Docker возле часов пункт **Switch to Windows containers** означает, что Linux-режим уже выбран.</w:t>
+      </w:r>
+    </w:p>
+    <w:p>
+      <w:r>
+        <w:t>При установке Docker может потребоваться аппаратная виртуализация. Если Docker сообщает о WSL, попробуйте обновить WSL через предложенную самим Docker подсказку. На рабочем компьютере для изменения системных настроек может понадобиться администратор.</w:t>
+      </w:r>
+    </w:p>
+    <w:p>
+      <w:bookmarkStart w:id="1" w:name="section_1"/>
+      <w:pPr>
+        <w:pStyle w:val="Heading1"/>
+      </w:pPr>
+      <w:r>
+        <w:t>2. Скачайте проект</w:t>
+      </w:r>
+      <w:bookmarkEnd w:id="1"/>
+    </w:p>
+    <w:p>
+      <w:pPr>
+        <w:pStyle w:val="ListParagraph"/>
+      </w:pPr>
+      <w:r>
+        <w:t xml:space="preserve">1. Откройте страницу проекта: </w:t>
+      </w:r>
+      <w:hyperlink r:id="rId11">
+        <w:r>
+          <w:rPr>
+            <w:color w:val="2457B7"/>
+          </w:rPr>
+          <w:t>https://github.com/ilnurcode/testpilot_1c</w:t>
+        </w:r>
+      </w:hyperlink>
+      <w:r/>
+    </w:p>
+    <w:p>
+      <w:pPr>
+        <w:pStyle w:val="ListParagraph"/>
+      </w:pPr>
+      <w:r>
+        <w:t>2. Нажмите зелёную кнопку **Code**, затем **Download ZIP**.</w:t>
+      </w:r>
+    </w:p>
+    <w:p>
+      <w:pPr>
+        <w:pStyle w:val="ListParagraph"/>
+      </w:pPr>
+      <w:r>
+        <w:t>3. Дождитесь загрузки архива и выберите **Извлечь всё** в Проводнике.</w:t>
+      </w:r>
+    </w:p>
+    <w:p>
+      <w:pPr>
+        <w:pStyle w:val="ListParagraph"/>
+      </w:pPr>
+      <w:r>
+        <w:t>4. Откройте распакованную папку `testpilot_1c-main`.</w:t>
+      </w:r>
+    </w:p>
+    <w:p>
+      <w:r>
+        <w:t>Локальные Git и Python для этого варианта не нужны. Не запускайте `.ps1` и не вводите команды в терминал. Не запускайте файл напрямую из окна ZIP: сначала извлеките его целиком. Внутри папки должен быть файл `compose.yaml`.</w:t>
+      </w:r>
+    </w:p>
+    <w:p>
+      <w:bookmarkStart w:id="2" w:name="section_2"/>
+      <w:pPr>
+        <w:pStyle w:val="Heading1"/>
+      </w:pPr>
+      <w:r>
+        <w:t>3. Запустите TestPilot</w:t>
+      </w:r>
+      <w:bookmarkEnd w:id="2"/>
+    </w:p>
+    <w:p>
+      <w:r>
+        <w:t>Дважды щёлкните:</w:t>
       </w:r>
     </w:p>
     <w:p>
@@ -473,63 +411,22 @@
           <w:color w:val="17365D"/>
           <w:sz w:val="17"/>
         </w:rPr>
-        <w:t>py -3.12 --version</w:t>
+        <w:t>Run-TestPilot.bat</w:t>
       </w:r>
     </w:p>
     <w:p>
       <w:r>
-        <w:t>Ожидается ответ вида Python 3.12.x. Если команда не найдена, закройте и заново откройте PowerShell. Если это не помогло, проверьте установку Python Launcher. Нужна именно ветка 3.12, а не просто любая установленная версия Python.</w:t>
+        <w:t>Если расширения файлов скрыты Проводником, имя может отображаться как **Run-TestPilot**. Windows откроет небольшое чёрное окно запуска. Не закрывайте его до появления сообщения о готовности. Если Windows показывает подтверждение запуска скачанного файла, проверьте, что вы распаковали ZIP репозитория TestPilot, и запускайте этот файл из распакованной папки.</w:t>
       </w:r>
     </w:p>
     <w:p>
-      <w:bookmarkStart w:id="2" w:name="section_2"/>
-      <w:pPr>
-        <w:pStyle w:val="Heading1"/>
-      </w:pPr>
       <w:r>
-        <w:t>3. Установка Git</w:t>
-      </w:r>
-      <w:bookmarkEnd w:id="2"/>
-    </w:p>
-    <w:p>
-      <w:pPr>
-        <w:pStyle w:val="ListParagraph"/>
-      </w:pPr>
-      <w:r>
-        <w:t xml:space="preserve">1. Откройте </w:t>
-      </w:r>
-      <w:hyperlink r:id="rId13">
-        <w:r>
-          <w:rPr>
-            <w:color w:val="2457B7"/>
-          </w:rPr>
-          <w:t>https://git-scm.com/download/win</w:t>
-        </w:r>
-      </w:hyperlink>
-      <w:r/>
-    </w:p>
-    <w:p>
-      <w:pPr>
-        <w:pStyle w:val="ListParagraph"/>
-      </w:pPr>
-      <w:r>
-        <w:t>2. Скачайте установщик и установите Git. Стандартные параметры подходят для этой инструкции.</w:t>
+        <w:t>При первом запуске лаунчер откроет Docker Desktop, если тот ещё не запущен, и подождёт запуска движка. Затем Docker скачает базовый образ, Python-библиотеки и Chromium и соберёт контейнеры. Это может занять несколько минут; время зависит от скорости интернета и компьютера. Желательно иметь не менее 5 ГБ свободного места. Во время первой загрузки может появиться окно Docker Desktop с условиями использования — завершите настройку.</w:t>
       </w:r>
     </w:p>
     <w:p>
-      <w:pPr>
-        <w:pStyle w:val="ListParagraph"/>
-      </w:pPr>
       <w:r>
-        <w:t>3. Откройте новое окно PowerShell.</w:t>
-      </w:r>
-    </w:p>
-    <w:p>
-      <w:pPr>
-        <w:pStyle w:val="ListParagraph"/>
-      </w:pPr>
-      <w:r>
-        <w:t>4. Проверьте установку.</w:t>
+        <w:t>Когда увидите:</w:t>
       </w:r>
     </w:p>
     <w:p>
@@ -545,406 +442,12 @@
           <w:color w:val="17365D"/>
           <w:sz w:val="17"/>
         </w:rPr>
-        <w:t>git --version</w:t>
+        <w:t>TestPilot is ready: http://localhost:8000</w:t>
       </w:r>
     </w:p>
     <w:p>
       <w:r>
-        <w:t>Должна появиться версия Git. Git нужен для скачивания и последующего обновления исходного кода.</w:t>
-      </w:r>
-    </w:p>
-    <w:p>
-      <w:bookmarkStart w:id="3" w:name="section_3"/>
-      <w:pPr>
-        <w:pStyle w:val="Heading1"/>
-      </w:pPr>
-      <w:r>
-        <w:t>4. Установка и проверка Docker Desktop</w:t>
-      </w:r>
-      <w:bookmarkEnd w:id="3"/>
-    </w:p>
-    <w:p>
-      <w:r>
-        <w:t>Docker запускает PostgreSQL — базу данных, в которой сохраняются проекты, исходные файлы, версии и отчёты.</w:t>
-      </w:r>
-    </w:p>
-    <w:p>
-      <w:pPr>
-        <w:pStyle w:val="ListParagraph"/>
-      </w:pPr>
-      <w:r>
-        <w:t xml:space="preserve">1. Откройте официальную инструкцию: </w:t>
-      </w:r>
-      <w:hyperlink r:id="rId14">
-        <w:r>
-          <w:rPr>
-            <w:color w:val="2457B7"/>
-          </w:rPr>
-          <w:t>https://docs.docker.com/desktop/setup/install/windows-install/</w:t>
-        </w:r>
-      </w:hyperlink>
-      <w:r/>
-    </w:p>
-    <w:p>
-      <w:pPr>
-        <w:pStyle w:val="ListParagraph"/>
-      </w:pPr>
-      <w:r>
-        <w:t>2. Установите Docker Desktop. Используйте рекомендуемый WSL2 backend и режим Linux containers.</w:t>
-      </w:r>
-    </w:p>
-    <w:p>
-      <w:pPr>
-        <w:pStyle w:val="ListParagraph"/>
-      </w:pPr>
-      <w:r>
-        <w:t>3. Перезагрузите компьютер, если этого требует установщик.</w:t>
-      </w:r>
-    </w:p>
-    <w:p>
-      <w:pPr>
-        <w:pStyle w:val="ListParagraph"/>
-      </w:pPr>
-      <w:r>
-        <w:t>4. Запустите Docker Desktop через меню «Пуск» и завершите первоначальную настройку.</w:t>
-      </w:r>
-    </w:p>
-    <w:p>
-      <w:pPr>
-        <w:pStyle w:val="ListParagraph"/>
-      </w:pPr>
-      <w:r>
-        <w:t>5. Дождитесь статуса работающего движка — например, Engine running.</w:t>
-      </w:r>
-    </w:p>
-    <w:p>
-      <w:r>
-        <w:t>Отдельную Ubuntu устанавливать и открывать для этого проекта не нужно. При установке Docker может потребоваться включённая аппаратная виртуализация в UEFI/BIOS. Если это рабочий компьютер, за изменением системных настроек обратитесь к администратору.</w:t>
-      </w:r>
-    </w:p>
-    <w:p>
-      <w:r>
-        <w:t>В PowerShell выполните:</w:t>
-      </w:r>
-    </w:p>
-    <w:p>
-      <w:pPr>
-        <w:keepLines/>
-        <w:spacing w:line="252" w:lineRule="auto" w:before="60" w:after="180"/>
-        <w:ind w:left="85" w:right="57"/>
-        <w:shd w:fill="EDF2F8"/>
-      </w:pPr>
-      <w:r>
-        <w:rPr>
-          <w:rFonts w:ascii="Consolas" w:hAnsi="Consolas"/>
-          <w:color w:val="17365D"/>
-          <w:sz w:val="17"/>
-        </w:rPr>
-        <w:t>docker version</w:t>
-        <w:br/>
-        <w:t>docker compose version</w:t>
-        <w:br/>
-        <w:t>docker info --format '{{.OSType}}'</w:t>
-      </w:r>
-    </w:p>
-    <w:p>
-      <w:r>
-        <w:t>Ожидается: docker version показывает Client и Server; Compose имеет версию v2; последняя команда выводит linux.</w:t>
-      </w:r>
-    </w:p>
-    <w:p>
-      <w:r>
-        <w:t>Если появляется ошибка failed to connect to the docker API, dockerDesktopLinuxEngine или The system cannot find the file specified, Linux-движок Docker недоступен. Сначала запустите Docker Desktop и дождитесь его готовности.</w:t>
-      </w:r>
-    </w:p>
-    <w:p>
-      <w:r>
-        <w:t>Если Docker работает в режиме Windows containers, выберите Switch to Linux containers в меню значка Docker возле часов. Если в меню написано Switch to Windows containers, Linux-режим уже выбран.</w:t>
-      </w:r>
-    </w:p>
-    <w:p>
-      <w:r>
-        <w:t>Если Docker требует обновить WSL, выполните:</w:t>
-      </w:r>
-    </w:p>
-    <w:p>
-      <w:pPr>
-        <w:keepLines/>
-        <w:spacing w:line="252" w:lineRule="auto" w:before="60" w:after="180"/>
-        <w:ind w:left="85" w:right="57"/>
-        <w:shd w:fill="EDF2F8"/>
-      </w:pPr>
-      <w:r>
-        <w:rPr>
-          <w:rFonts w:ascii="Consolas" w:hAnsi="Consolas"/>
-          <w:color w:val="17365D"/>
-          <w:sz w:val="17"/>
-        </w:rPr>
-        <w:t>wsl --update</w:t>
-      </w:r>
-    </w:p>
-    <w:p>
-      <w:r>
-        <w:t>После этого перезапустите Docker Desktop. Для обновления WSL могут потребоваться права администратора. Если Docker по-прежнему не запускается, проверьте статус WSL:</w:t>
-      </w:r>
-    </w:p>
-    <w:p>
-      <w:pPr>
-        <w:keepLines/>
-        <w:spacing w:line="252" w:lineRule="auto" w:before="60" w:after="180"/>
-        <w:ind w:left="85" w:right="57"/>
-        <w:shd w:fill="EDF2F8"/>
-      </w:pPr>
-      <w:r>
-        <w:rPr>
-          <w:rFonts w:ascii="Consolas" w:hAnsi="Consolas"/>
-          <w:color w:val="17365D"/>
-          <w:sz w:val="17"/>
-        </w:rPr>
-        <w:t>wsl --status</w:t>
-      </w:r>
-    </w:p>
-    <w:p>
-      <w:r>
-        <w:t>Не переходите к установке зависимостей проекта, пока Docker не показывает работающий Server и тип linux.</w:t>
-      </w:r>
-    </w:p>
-    <w:p>
-      <w:bookmarkStart w:id="4" w:name="section_4"/>
-      <w:pPr>
-        <w:pStyle w:val="Heading1"/>
-      </w:pPr>
-      <w:r>
-        <w:t>5. Скачивание проекта</w:t>
-      </w:r>
-      <w:bookmarkEnd w:id="4"/>
-    </w:p>
-    <w:p>
-      <w:r>
-        <w:t>Откройте обычный PowerShell. Создайте папку для проектов и скачайте исходники:</w:t>
-      </w:r>
-    </w:p>
-    <w:p>
-      <w:pPr>
-        <w:keepLines/>
-        <w:spacing w:line="252" w:lineRule="auto" w:before="60" w:after="180"/>
-        <w:ind w:left="85" w:right="57"/>
-        <w:shd w:fill="EDF2F8"/>
-      </w:pPr>
-      <w:r>
-        <w:rPr>
-          <w:rFonts w:ascii="Consolas" w:hAnsi="Consolas"/>
-          <w:color w:val="17365D"/>
-          <w:sz w:val="17"/>
-        </w:rPr>
-        <w:t>New-Item -ItemType Directory -Force "$HOME\Projects" | Out-Null</w:t>
-        <w:br/>
-        <w:t>Set-Location "$HOME\Projects"</w:t>
-        <w:br/>
-        <w:t>git clone https://github.com/ilnurcode/testpilot_1c.git</w:t>
-        <w:br/>
-        <w:t>Set-Location testpilot_1c</w:t>
-      </w:r>
-    </w:p>
-    <w:p>
-      <w:r>
-        <w:t>После этого приглашение терминала будет примерно таким: PS C:\Users\ИмяПользователя\Projects\testpilot_1c&gt;</w:t>
-      </w:r>
-    </w:p>
-    <w:p>
-      <w:r>
-        <w:t>Все последующие команды проекта выполняйте из этой папки. Чтобы вернуться в неё из другого места, используйте:</w:t>
-      </w:r>
-    </w:p>
-    <w:p>
-      <w:pPr>
-        <w:keepLines/>
-        <w:spacing w:line="252" w:lineRule="auto" w:before="60" w:after="180"/>
-        <w:ind w:left="85" w:right="57"/>
-        <w:shd w:fill="EDF2F8"/>
-      </w:pPr>
-      <w:r>
-        <w:rPr>
-          <w:rFonts w:ascii="Consolas" w:hAnsi="Consolas"/>
-          <w:color w:val="17365D"/>
-          <w:sz w:val="17"/>
-        </w:rPr>
-        <w:t>Set-Location "$HOME\Projects\testpilot_1c"</w:t>
-      </w:r>
-    </w:p>
-    <w:p>
-      <w:r>
-        <w:t>Если репозиторий приватный, войдите в GitHub разрешённым способом на своём компьютере; пользователю нужен доступ к репозиторию. Не вставляйте токены в URL или сообщения.</w:t>
-      </w:r>
-    </w:p>
-    <w:p>
-      <w:r>
-        <w:t>Если папка уже существует, не клонируйте поверх неё. Используйте существующий checkout и раздел «Обновление проекта».</w:t>
-      </w:r>
-    </w:p>
-    <w:p>
-      <w:r>
-        <w:t>Не размещайте рабочую папку в OneDrive. Не переносите виртуальное окружение .venv из Linux: оно несовместимо с Windows. На другом ПК лучше выполнить свежую установку по этой инструкции.</w:t>
-      </w:r>
-    </w:p>
-    <w:p>
-      <w:bookmarkStart w:id="5" w:name="section_5"/>
-      <w:pPr>
-        <w:pStyle w:val="Heading1"/>
-      </w:pPr>
-      <w:r>
-        <w:t>6. Установка зависимостей проекта</w:t>
-      </w:r>
-      <w:bookmarkEnd w:id="5"/>
-    </w:p>
-    <w:p>
-      <w:r>
-        <w:t>В PowerShell, из папки проекта, разрешите запуск локальных скриптов только в текущем окне:</w:t>
-      </w:r>
-    </w:p>
-    <w:p>
-      <w:pPr>
-        <w:keepLines/>
-        <w:spacing w:line="252" w:lineRule="auto" w:before="60" w:after="180"/>
-        <w:ind w:left="85" w:right="57"/>
-        <w:shd w:fill="EDF2F8"/>
-      </w:pPr>
-      <w:r>
-        <w:rPr>
-          <w:rFonts w:ascii="Consolas" w:hAnsi="Consolas"/>
-          <w:color w:val="17365D"/>
-          <w:sz w:val="17"/>
-        </w:rPr>
-        <w:t>Set-ExecutionPolicy -Scope Process -ExecutionPolicy RemoteSigned</w:t>
-      </w:r>
-    </w:p>
-    <w:p>
-      <w:r>
-        <w:t>Если появится запрос, подтвердите изменение. Постоянная политика компьютера не меняется. Если действует корпоративная Group Policy, обратитесь к администратору; обходить её не нужно.</w:t>
-      </w:r>
-    </w:p>
-    <w:p>
-      <w:r>
-        <w:t>Убедитесь, что Docker Desktop работает, затем выполните:</w:t>
-      </w:r>
-    </w:p>
-    <w:p>
-      <w:pPr>
-        <w:keepLines/>
-        <w:spacing w:line="252" w:lineRule="auto" w:before="60" w:after="180"/>
-        <w:ind w:left="85" w:right="57"/>
-        <w:shd w:fill="EDF2F8"/>
-      </w:pPr>
-      <w:r>
-        <w:rPr>
-          <w:rFonts w:ascii="Consolas" w:hAnsi="Consolas"/>
-          <w:color w:val="17365D"/>
-          <w:sz w:val="17"/>
-        </w:rPr>
-        <w:t>.\scripts\install.ps1</w:t>
-      </w:r>
-    </w:p>
-    <w:p>
-      <w:r>
-        <w:t>Скрипт проверит Docker и Python, создаст .venv, установит зависимости, создаст локальный .env со случайными паролями, скачает совместимый Chromium для Playwright и проверит запуск браузера. При первой установке нужен интернет. Активация .venv вручную не требуется.</w:t>
-      </w:r>
-    </w:p>
-    <w:p>
-      <w:r>
-        <w:t>Дождитесь завершения команды и возврата приглашения PowerShell. Признак успешного завершения:</w:t>
-      </w:r>
-    </w:p>
-    <w:p>
-      <w:pPr>
-        <w:keepLines/>
-        <w:spacing w:line="252" w:lineRule="auto" w:before="60" w:after="180"/>
-        <w:ind w:left="85" w:right="57"/>
-        <w:shd w:fill="EDF2F8"/>
-      </w:pPr>
-      <w:r>
-        <w:rPr>
-          <w:rFonts w:ascii="Consolas" w:hAnsi="Consolas"/>
-          <w:color w:val="17365D"/>
-          <w:sz w:val="17"/>
-        </w:rPr>
-        <w:t>Installed. Run: .\scripts\start.ps1</w:t>
-      </w:r>
-    </w:p>
-    <w:p>
-      <w:r>
-        <w:t>Существующий .env сохраняется. Не копируйте пустой .env.example поверх созданного файла.</w:t>
-      </w:r>
-    </w:p>
-    <w:p>
-      <w:r>
-        <w:t>Если вы перенесли .env с Linux и в нём есть TP_CHROMIUM_PATH=/usr/bin/chromium, удалите или исправьте только эту строку. Без явного переопределения Windows использует Chromium Playwright автоматически. Chrome или Edge, установленный в Windows, не заменяет скачивание браузера Playwright.</w:t>
-      </w:r>
-    </w:p>
-    <w:p>
-      <w:r>
-        <w:t>Если установщик обнаружил несовместимую .venv, сохраните .env, переименуйте только папку .venv и повторите установку.</w:t>
-      </w:r>
-    </w:p>
-    <w:p>
-      <w:bookmarkStart w:id="6" w:name="section_6"/>
-      <w:pPr>
-        <w:pStyle w:val="Heading1"/>
-      </w:pPr>
-      <w:r>
-        <w:t>7. Первый запуск сервиса</w:t>
-      </w:r>
-      <w:bookmarkEnd w:id="6"/>
-    </w:p>
-    <w:p>
-      <w:r>
-        <w:t>Из корня проекта выполните:</w:t>
-      </w:r>
-    </w:p>
-    <w:p>
-      <w:pPr>
-        <w:keepLines/>
-        <w:spacing w:line="252" w:lineRule="auto" w:before="60" w:after="180"/>
-        <w:ind w:left="85" w:right="57"/>
-        <w:shd w:fill="EDF2F8"/>
-      </w:pPr>
-      <w:r>
-        <w:rPr>
-          <w:rFonts w:ascii="Consolas" w:hAnsi="Consolas"/>
-          <w:color w:val="17365D"/>
-          <w:sz w:val="17"/>
-        </w:rPr>
-        <w:t>.\scripts\start.ps1</w:t>
-      </w:r>
-    </w:p>
-    <w:p>
-      <w:r>
-        <w:t>Скрипт проверит Chromium, поднимет PostgreSQL в Docker, применит миграции и запустит три приложения в фоне на 127.0.0.1. При первой загрузке Docker-образа потребуется подождать.</w:t>
-      </w:r>
-    </w:p>
-    <w:p>
-      <w:r>
-        <w:t>Дождитесь сообщения:</w:t>
-      </w:r>
-    </w:p>
-    <w:p>
-      <w:pPr>
-        <w:keepLines/>
-        <w:spacing w:line="252" w:lineRule="auto" w:before="60" w:after="180"/>
-        <w:ind w:left="85" w:right="57"/>
-        <w:shd w:fill="EDF2F8"/>
-      </w:pPr>
-      <w:r>
-        <w:rPr>
-          <w:rFonts w:ascii="Consolas" w:hAnsi="Consolas"/>
-          <w:color w:val="17365D"/>
-          <w:sz w:val="17"/>
-        </w:rPr>
-        <w:t>Ready: http://localhost:8000</w:t>
-      </w:r>
-    </w:p>
-    <w:p>
-      <w:r>
-        <w:t>Откройте в обычном браузере Windows:</w:t>
+        <w:t>лаунчер сам откроет браузер. Если страница не открылась, нажмите в нём ссылку или откройте вручную:</w:t>
       </w:r>
     </w:p>
     <w:p>
@@ -965,172 +468,68 @@
     </w:p>
     <w:p>
       <w:r>
-        <w:t xml:space="preserve">Если адрес не открылся, попробуйте </w:t>
-      </w:r>
-      <w:hyperlink r:id="rId15">
-        <w:r>
-          <w:rPr>
-            <w:color w:val="2457B7"/>
-          </w:rPr>
-          <w:t>http://127.0.0.1:8000.</w:t>
-        </w:r>
-      </w:hyperlink>
-      <w:r>
-        <w:t xml:space="preserve"> Исходные данные демонстрации автоматически не загружаются. Для остановки используйте специальный скрипт из раздела 13.</w:t>
+        <w:t>На локальном компьютере используйте логин **expert** и пароль **TestPilotLocal123!**, если вы не задавали свои настройки в файле `.env`.</w:t>
       </w:r>
     </w:p>
     <w:p>
-      <w:bookmarkStart w:id="7" w:name="section_7"/>
+      <w:r>
+        <w:t>Лаунчер покажет диагностику, если Docker Desktop не найден, не готов или сборка завершилась ошибкой. Оставьте окно открытым и прочитайте сообщение внизу. Повторный запуск того же файла продолжает сборку или запускает уже созданные контейнеры.</w:t>
+      </w:r>
+    </w:p>
+    <w:p>
+      <w:bookmarkStart w:id="3" w:name="section_3"/>
       <w:pPr>
         <w:pStyle w:val="Heading1"/>
       </w:pPr>
       <w:r>
-        <w:t>8. Пароль и вход в сервис</w:t>
+        <w:t>4. Что происходит при запуске</w:t>
       </w:r>
-      <w:bookmarkEnd w:id="7"/>
+      <w:bookmarkEnd w:id="3"/>
     </w:p>
     <w:p>
       <w:r>
-        <w:t>Файл .env создаётся локально установщиком. Чтобы открыть его, выполните из папки проекта:</w:t>
-      </w:r>
-    </w:p>
-    <w:p>
-      <w:pPr>
-        <w:keepLines/>
-        <w:spacing w:line="252" w:lineRule="auto" w:before="60" w:after="180"/>
-        <w:ind w:left="85" w:right="57"/>
-        <w:shd w:fill="EDF2F8"/>
-      </w:pPr>
-      <w:r>
-        <w:rPr>
-          <w:rFonts w:ascii="Consolas" w:hAnsi="Consolas"/>
-          <w:color w:val="17365D"/>
-          <w:sz w:val="17"/>
-        </w:rPr>
-        <w:t>notepad .env</w:t>
+        <w:t>Docker Compose поднимает PostgreSQL, одноразовый контейнер миграций, два API и веб-приложение. Chromium находится в контейнере исполнителя. Весь код работает внутри Docker; localhost:8000 — только локально открытый веб-интерфейс.</w:t>
       </w:r>
     </w:p>
     <w:p>
       <w:r>
-        <w:t>Найдите строку:</w:t>
-      </w:r>
-    </w:p>
-    <w:p>
-      <w:pPr>
-        <w:keepLines/>
-        <w:spacing w:line="252" w:lineRule="auto" w:before="60" w:after="180"/>
-        <w:ind w:left="85" w:right="57"/>
-        <w:shd w:fill="EDF2F8"/>
-      </w:pPr>
-      <w:r>
-        <w:rPr>
-          <w:rFonts w:ascii="Consolas" w:hAnsi="Consolas"/>
-          <w:color w:val="17365D"/>
-          <w:sz w:val="17"/>
-        </w:rPr>
-        <w:t>TP_EXPERT_PASSWORD=значение_пароля</w:t>
+        <w:t>Веб-приложение доступно только на этом компьютере. Порты базы данных не открываются для других устройств сети. Текущие локальные учётные записи и настройки предназначены для демонстрации на личном компьютере, не для размещения публичного сайта.</w:t>
       </w:r>
     </w:p>
     <w:p>
       <w:r>
-        <w:t>В браузере используйте логин expert и всё значение после знака =. Не копируйте название TP_EXPERT_PASSWORD= в поле пароля.</w:t>
+        <w:t>В базе сохраняются загруженные файлы, проекты, планы, история, результаты и скриншоты. Они находятся в именованном Docker volume, поэтому сохраняются при остановке и следующем запуске. Удаление проекта через Docker Desktop или сброс данных Docker может стереть их.</w:t>
+      </w:r>
+    </w:p>
+    <w:p>
+      <w:bookmarkStart w:id="4" w:name="section_4"/>
+      <w:pPr>
+        <w:pStyle w:val="Heading1"/>
+      </w:pPr>
+      <w:r>
+        <w:t>5. Первый вход</w:t>
+      </w:r>
+      <w:bookmarkEnd w:id="4"/>
+    </w:p>
+    <w:p>
+      <w:r>
+        <w:t>При первом запуске без пользовательского `.env` используйте логин `expert` и пароль `TestPilotLocal123!`. Если вы создавали собственный `.env`, пароль находится в его строке `TP_EXPERT_PASSWORD`. Не показывайте настройки и ключи на записи экрана.</w:t>
       </w:r>
     </w:p>
     <w:p>
       <w:r>
-        <w:t>Роль expert подходит для демонстрации: она позволяет подтверждать сценарии и запускать учебные проверки. Другие роли — analyst и runner — имеют отдельные пароли в .env.</w:t>
+        <w:t>После появления готового интерфейса нажмите «Обзор» и «Открыть демонстрацию». Для подробного показа следуйте разделу 7.</w:t>
       </w:r>
     </w:p>
     <w:p>
-      <w:r>
-        <w:t>В .env также хранится пароль базы и могут храниться API-ключи. Не отправляйте файл другим людям, не публикуйте его в GitHub, не показывайте во время трансляции экрана. В Windows храните проект в личной папке пользователя с подходящими NTFS-правами.</w:t>
-      </w:r>
-    </w:p>
-    <w:p>
-      <w:r>
-        <w:t>На другом ПК установщик создаёт собственные пароли. Не удаляйте .env при уже созданной базе: новый случайный пароль не меняет пароль сохранённой PostgreSQL. Сделайте защищённую копию .env. Исходная папка проекта сама по себе не является резервной копией БД: данные находятся в Docker volume testpilot_pgdata.</w:t>
-      </w:r>
-    </w:p>
-    <w:p>
-      <w:bookmarkStart w:id="8" w:name="section_8"/>
+      <w:bookmarkStart w:id="5" w:name="section_5"/>
       <w:pPr>
         <w:pStyle w:val="Heading1"/>
       </w:pPr>
       <w:r>
-        <w:t>9. Проверка установки</w:t>
+        <w:t>6. Работа в интерфейсе</w:t>
       </w:r>
-      <w:bookmarkEnd w:id="8"/>
-    </w:p>
-    <w:p>
-      <w:r>
-        <w:t>При запущенном сервисе выполните:</w:t>
-      </w:r>
-    </w:p>
-    <w:p>
-      <w:pPr>
-        <w:keepLines/>
-        <w:spacing w:line="252" w:lineRule="auto" w:before="60" w:after="180"/>
-        <w:ind w:left="85" w:right="57"/>
-        <w:shd w:fill="EDF2F8"/>
-      </w:pPr>
-      <w:r>
-        <w:rPr>
-          <w:rFonts w:ascii="Consolas" w:hAnsi="Consolas"/>
-          <w:color w:val="17365D"/>
-          <w:sz w:val="17"/>
-        </w:rPr>
-        <w:t>Invoke-RestMethod http://127.0.0.1:8000/health</w:t>
-      </w:r>
-    </w:p>
-    <w:p>
-      <w:r>
-        <w:t>Ответ должен содержать status со значением ok.</w:t>
-      </w:r>
-    </w:p>
-    <w:p>
-      <w:r>
-        <w:t>Для дополнительной автоматической проверки учебного сценария:</w:t>
-      </w:r>
-    </w:p>
-    <w:p>
-      <w:pPr>
-        <w:keepLines/>
-        <w:spacing w:line="252" w:lineRule="auto" w:before="60" w:after="180"/>
-        <w:ind w:left="85" w:right="57"/>
-        <w:shd w:fill="EDF2F8"/>
-      </w:pPr>
-      <w:r>
-        <w:rPr>
-          <w:rFonts w:ascii="Consolas" w:hAnsi="Consolas"/>
-          <w:color w:val="17365D"/>
-          <w:sz w:val="17"/>
-        </w:rPr>
-        <w:t>. .\scripts\windows-common.ps1</w:t>
-        <w:br/>
-        <w:t>Import-LocalEnv</w:t>
-        <w:br/>
-        <w:t>&amp; .\.venv\Scripts\python.exe scripts\presentation-smoke.py</w:t>
-      </w:r>
-    </w:p>
-    <w:p>
-      <w:r>
-        <w:t>Первая строка начинается с точки и пробела — они нужны. Команды загружают локальные настройки без печати секретов и выполняют учебный сценарий.</w:t>
-      </w:r>
-    </w:p>
-    <w:p>
-      <w:r>
-        <w:t>Ожидаемый результат содержит passed=2, failed=2, error=0, screenshots=2. Проверка создаёт учебный анализ, выполняет реальные HTTP/Playwright-запросы и проверяет сохранение истории и PNG. Две неуспешные проверки ожидаемы: в учебном приложении намеренно оставлена ошибка расчёта скидки.</w:t>
-      </w:r>
-    </w:p>
-    <w:p>
-      <w:bookmarkStart w:id="9" w:name="section_9"/>
-      <w:pPr>
-        <w:pStyle w:val="Heading1"/>
-      </w:pPr>
-      <w:r>
-        <w:t>10. Использование сервиса</w:t>
-      </w:r>
-      <w:bookmarkEnd w:id="9"/>
+      <w:bookmarkEnd w:id="5"/>
     </w:p>
     <w:p>
       <w:r>
@@ -1785,14 +1184,14 @@
       </w:pPr>
     </w:p>
     <w:p>
-      <w:bookmarkStart w:id="10" w:name="section_10"/>
+      <w:bookmarkStart w:id="6" w:name="section_6"/>
       <w:pPr>
         <w:pStyle w:val="Heading1"/>
       </w:pPr>
       <w:r>
-        <w:t>11. Демонстрация на 7–10 минут</w:t>
+        <w:t>7. Демонстрация на 7–10 минут</w:t>
       </w:r>
-      <w:bookmarkEnd w:id="10"/>
+      <w:bookmarkEnd w:id="6"/>
     </w:p>
     <w:p>
       <w:r>
@@ -2356,14 +1755,14 @@
       </w:r>
     </w:p>
     <w:p>
-      <w:bookmarkStart w:id="11" w:name="section_11"/>
+      <w:bookmarkStart w:id="7" w:name="section_7"/>
       <w:pPr>
         <w:pStyle w:val="Heading1"/>
       </w:pPr>
       <w:r>
-        <w:t>12. Настройка нейросети — необязательно</w:t>
+        <w:t>8. Нейросеть — необязательная настройка</w:t>
       </w:r>
-      <w:bookmarkEnd w:id="11"/>
+      <w:bookmarkEnd w:id="7"/>
     </w:p>
     <w:p>
       <w:r>
@@ -2434,7 +1833,7 @@
           <w:color w:val="17365D"/>
           <w:sz w:val="17"/>
         </w:rPr>
-        <w:t>.\scripts\start.ps1</w:t>
+        <w:t>Run-TestPilot.bat</w:t>
       </w:r>
     </w:p>
     <w:p>
@@ -2448,18 +1847,18 @@
       </w:r>
     </w:p>
     <w:p>
-      <w:bookmarkStart w:id="12" w:name="section_12"/>
+      <w:bookmarkStart w:id="8" w:name="section_8"/>
       <w:pPr>
         <w:pStyle w:val="Heading1"/>
       </w:pPr>
       <w:r>
-        <w:t>13. Остановка и следующий запуск</w:t>
+        <w:t>9. Остановка и повторный запуск</w:t>
       </w:r>
-      <w:bookmarkEnd w:id="12"/>
+      <w:bookmarkEnd w:id="8"/>
     </w:p>
     <w:p>
       <w:r>
-        <w:t>Остановить только приложения, оставив PostgreSQL работающей:</w:t>
+        <w:t>Штатно остановить приложение можно двойным щелчком по файлу:</w:t>
       </w:r>
     </w:p>
     <w:p>
@@ -2475,120 +1874,69 @@
           <w:color w:val="17365D"/>
           <w:sz w:val="17"/>
         </w:rPr>
-        <w:t>.\scripts\stop.ps1</w:t>
+        <w:t>Stop-TestPilot.bat</w:t>
       </w:r>
     </w:p>
     <w:p>
       <w:r>
-        <w:t>Остановить приложения и базу:</w:t>
-      </w:r>
-    </w:p>
-    <w:p>
-      <w:pPr>
-        <w:keepLines/>
-        <w:spacing w:line="252" w:lineRule="auto" w:before="60" w:after="180"/>
-        <w:ind w:left="85" w:right="57"/>
-        <w:shd w:fill="EDF2F8"/>
-      </w:pPr>
-      <w:r>
-        <w:rPr>
-          <w:rFonts w:ascii="Consolas" w:hAnsi="Consolas"/>
-          <w:color w:val="17365D"/>
-          <w:sz w:val="17"/>
-        </w:rPr>
-        <w:t>.\scripts\stop.ps1 -Database</w:t>
+        <w:t>Остановится Docker Compose проект, база и контейнеры. Именованный том `testpilot_pgdata`, исходники и ваши настройки сохранятся.</w:t>
       </w:r>
     </w:p>
     <w:p>
       <w:r>
-        <w:t>Исходные файлы, отчёты, .env и volume testpilot_pgdata сохраняются. Скрипты проверяют принадлежность процессов этому проекту и останавливают также дочерние процессы Windows Python launcher.</w:t>
+        <w:t>Чтобы запустить снова, двойным щелчком нажмите `Run-TestPilot.bat`. После перезагрузки компьютера запустите Docker Desktop, если он не стартовал вместе с Windows; лаунчер подождёт его и откроет браузер.</w:t>
       </w:r>
     </w:p>
     <w:p>
       <w:r>
-        <w:t>После перезагрузки компьютера запустите Docker Desktop, дождитесь готовности движка, откройте PowerShell и выполните:</w:t>
+        <w:t>Не нажимайте Delete volumes, не сбрасывайте данные Docker Desktop и не запускайте удаление томов, если нужно сохранить проекты и результаты. Остановочный файл удаляет контейнеры, но не том.</w:t>
       </w:r>
     </w:p>
     <w:p>
+      <w:bookmarkStart w:id="9" w:name="section_9"/>
       <w:pPr>
-        <w:keepLines/>
-        <w:spacing w:line="252" w:lineRule="auto" w:before="60" w:after="180"/>
-        <w:ind w:left="85" w:right="57"/>
-        <w:shd w:fill="EDF2F8"/>
+        <w:pStyle w:val="Heading1"/>
       </w:pPr>
       <w:r>
-        <w:rPr>
-          <w:rFonts w:ascii="Consolas" w:hAnsi="Consolas"/>
-          <w:color w:val="17365D"/>
-          <w:sz w:val="17"/>
-        </w:rPr>
-        <w:t>Set-Location "$HOME\Projects\testpilot_1c"</w:t>
-        <w:br/>
-        <w:t>Set-ExecutionPolicy -Scope Process -ExecutionPolicy RemoteSigned</w:t>
-        <w:br/>
-        <w:t>.\scripts\start.ps1</w:t>
+        <w:t>10. Обновление проекта</w:t>
+      </w:r>
+      <w:bookmarkEnd w:id="9"/>
+    </w:p>
+    <w:p>
+      <w:r>
+        <w:t xml:space="preserve">Для обновления скачайте свежий ZIP из GitHub: откройте </w:t>
+      </w:r>
+      <w:hyperlink r:id="rId13">
+        <w:r>
+          <w:rPr>
+            <w:color w:val="2457B7"/>
+          </w:rPr>
+          <w:t>https://github.com/ilnurcode/testpilot_1c,</w:t>
+        </w:r>
+      </w:hyperlink>
+      <w:r>
+        <w:t xml:space="preserve"> нажмите Code → Download ZIP и извлеките его в новую папку. Остановите прежний проект двойным щелчком по `Stop-TestPilot.bat`, затем запустите новый через `Run-TestPilot.bat`.</w:t>
       </w:r>
     </w:p>
     <w:p>
       <w:r>
-        <w:t>Повторять установку зависимостей при каждом запуске не требуется. Не используйте docker compose down -v, удаление volume или factory reset Docker для обычной остановки: это может удалить базу.</w:t>
+        <w:t>Compose-проект использует постоянное имя и именованный volume `testpilot_pgdata`, поэтому стандартное обновление с того же компьютера подключается к сохранённой базе даже из распакованной папки с тем же проектом. Если вы создавали `.env` и меняли учётные данные или задавали API-ключ, скопируйте его в новую папку. Держите резервную копию `.env` отдельно.</w:t>
       </w:r>
     </w:p>
     <w:p>
-      <w:bookmarkStart w:id="13" w:name="section_13"/>
+      <w:r>
+        <w:t>Не удаляйте Docker volume старой версии до проверки, что нужные файлы и отчёты видны в обновлённой. Не используйте `docker compose down -v`.</w:t>
+      </w:r>
+    </w:p>
+    <w:p>
+      <w:bookmarkStart w:id="10" w:name="section_10"/>
       <w:pPr>
         <w:pStyle w:val="Heading1"/>
       </w:pPr>
       <w:r>
-        <w:t>14. Обновление проекта</w:t>
+        <w:t>11. Устранение ошибок</w:t>
       </w:r>
-      <w:bookmarkEnd w:id="13"/>
-    </w:p>
-    <w:p>
-      <w:r>
-        <w:t>Если исходники локально не изменялись:</w:t>
-      </w:r>
-    </w:p>
-    <w:p>
-      <w:pPr>
-        <w:keepLines/>
-        <w:spacing w:line="252" w:lineRule="auto" w:before="60" w:after="180"/>
-        <w:ind w:left="85" w:right="57"/>
-        <w:shd w:fill="EDF2F8"/>
-      </w:pPr>
-      <w:r>
-        <w:rPr>
-          <w:rFonts w:ascii="Consolas" w:hAnsi="Consolas"/>
-          <w:color w:val="17365D"/>
-          <w:sz w:val="17"/>
-        </w:rPr>
-        <w:t>Set-Location "$HOME\Projects\testpilot_1c"</w:t>
-        <w:br/>
-        <w:t>Set-ExecutionPolicy -Scope Process -ExecutionPolicy RemoteSigned</w:t>
-        <w:br/>
-        <w:t>.\scripts\stop.ps1</w:t>
-        <w:br/>
-        <w:t>git pull --ff-only</w:t>
-        <w:br/>
-        <w:t>.\scripts\install.ps1</w:t>
-        <w:br/>
-        <w:t>.\scripts\start.ps1</w:t>
-      </w:r>
-    </w:p>
-    <w:p>
-      <w:r>
-        <w:t>Install обновит зависимости и браузер, start применит миграции. Локальный .env Git не заменяет. Если Git сообщает о локальных изменениях, сначала сохраните их. Не используйте reset --hard для обхода ошибки.</w:t>
-      </w:r>
-    </w:p>
-    <w:p>
-      <w:bookmarkStart w:id="14" w:name="section_14"/>
-      <w:pPr>
-        <w:pStyle w:val="Heading1"/>
-      </w:pPr>
-      <w:r>
-        <w:t>15. Устранение ошибок и обращение за помощью</w:t>
-      </w:r>
-      <w:bookmarkEnd w:id="14"/>
+      <w:bookmarkEnd w:id="10"/>
     </w:p>
     <w:tbl>
       <w:tblPr>
@@ -2657,7 +2005,7 @@
               <w:rPr>
                 <w:sz w:val="18"/>
               </w:rPr>
-              <w:t>py или Python 3.12 не найден</w:t>
+              <w:t>Docker Desktop не найден</w:t>
             </w:r>
           </w:p>
         </w:tc>
@@ -2673,7 +2021,7 @@
               <w:rPr>
                 <w:sz w:val="18"/>
               </w:rPr>
-              <w:t>Установлены Python 3.12 x64 и Launcher; PowerShell открыт заново</w:t>
+              <w:t>Установите Docker Desktop, перезагрузите Windows при необходимости и повторите двойной щелчок.</w:t>
             </w:r>
           </w:p>
         </w:tc>
@@ -2694,7 +2042,7 @@
               <w:rPr>
                 <w:sz w:val="18"/>
               </w:rPr>
-              <w:t>Скрипты запрещены</w:t>
+              <w:t>`dockerDesktopLinuxEngine` недоступен</w:t>
             </w:r>
           </w:p>
         </w:tc>
@@ -2710,7 +2058,7 @@
               <w:rPr>
                 <w:sz w:val="18"/>
               </w:rPr>
-              <w:t>Выполнена команда RemoteSigned для текущего окна; при корпоративной политике нужен администратор</w:t>
+              <w:t>Откройте Docker Desktop и дождитесь готовности Linux-движка.</w:t>
             </w:r>
           </w:p>
         </w:tc>
@@ -2731,7 +2079,7 @@
               <w:rPr>
                 <w:sz w:val="18"/>
               </w:rPr>
-              <w:t>dockerDesktopLinuxEngine недоступен</w:t>
+              <w:t>Лаунчер долго ждёт Docker</w:t>
             </w:r>
           </w:p>
         </w:tc>
@@ -2747,7 +2095,7 @@
               <w:rPr>
                 <w:sz w:val="18"/>
               </w:rPr>
-              <w:t>Docker Desktop запущен; Linux-движок готов</w:t>
+              <w:t>Завершите первоначальную настройку Docker Desktop. Если появится запрос принять условия использования, подтвердите его.</w:t>
             </w:r>
           </w:p>
         </w:tc>
@@ -2768,7 +2116,7 @@
               <w:rPr>
                 <w:sz w:val="18"/>
               </w:rPr>
-              <w:t>Chromium не найден</w:t>
+              <w:t>Docker не использует Linux containers</w:t>
             </w:r>
           </w:p>
         </w:tc>
@@ -2784,7 +2132,7 @@
               <w:rPr>
                 <w:sz w:val="18"/>
               </w:rPr>
-              <w:t>Повторите install.ps1; проверьте TP_CHROMIUM_PATH, не оставляйте Linux-путь /usr/bin/chromium</w:t>
+              <w:t>В меню Docker возле часов переключитесь на Linux containers.</w:t>
             </w:r>
           </w:p>
         </w:tc>
@@ -2805,7 +2153,7 @@
               <w:rPr>
                 <w:sz w:val="18"/>
               </w:rPr>
-              <w:t>Несовместимая .venv</w:t>
+              <w:t>Сборка прервалась</w:t>
             </w:r>
           </w:p>
         </w:tc>
@@ -2821,7 +2169,7 @@
               <w:rPr>
                 <w:sz w:val="18"/>
               </w:rPr>
-              <w:t>Не переносите окружение Linux. Переименуйте только .venv и повторите установку, сохранив .env</w:t>
+              <w:t>Проверьте интернет и свободное место. Оставьте Docker Desktop запущенным и повторите Run-TestPilot.bat. Лаунчер покажет недавние журналы сервисов.</w:t>
             </w:r>
           </w:p>
         </w:tc>
@@ -2842,7 +2190,7 @@
               <w:rPr>
                 <w:sz w:val="18"/>
               </w:rPr>
-              <w:t>Неверный логин или пароль</w:t>
+              <w:t>Браузер показывает `ERR_CONNECTION_REFUSED`</w:t>
             </w:r>
           </w:p>
         </w:tc>
@@ -2858,7 +2206,7 @@
               <w:rPr>
                 <w:sz w:val="18"/>
               </w:rPr>
-              <w:t>Используйте expert и пароль из .env именно этой установки</w:t>
+              <w:t>Оставьте Docker Desktop работающим. Убедитесь, что лаунчер сообщил о готовности; затем ещё раз запустите Run-TestPilot.bat.</w:t>
             </w:r>
           </w:p>
         </w:tc>
@@ -2879,7 +2227,7 @@
               <w:rPr>
                 <w:sz w:val="18"/>
               </w:rPr>
-              <w:t>Ошибка пароля PostgreSQL</w:t>
+              <w:t>Не удаётся войти</w:t>
             </w:r>
           </w:p>
         </w:tc>
@@ -2895,7 +2243,7 @@
               <w:rPr>
                 <w:sz w:val="18"/>
               </w:rPr>
-              <w:t>.env не заменялся после создания базы; восстановите исходный пароль из защищённой копии</w:t>
+              <w:t>Для чистой локальной установки без `.env` используйте `expert` / `TestPilotLocal123!`. Если есть `.env`, проверьте `TP_EXPERT_PASSWORD` в нём.</w:t>
             </w:r>
           </w:p>
         </w:tc>
@@ -2916,7 +2264,7 @@
               <w:rPr>
                 <w:sz w:val="18"/>
               </w:rPr>
-              <w:t>Порт занят</w:t>
+              <w:t>Исчезли сохранённые проекты</w:t>
             </w:r>
           </w:p>
         </w:tc>
@@ -2932,7 +2280,7 @@
               <w:rPr>
                 <w:sz w:val="18"/>
               </w:rPr>
-              <w:t>Другие приложения не используют 5432, 8000, 8001, 8002; не завершайте чужие процессы наугад</w:t>
+              <w:t>Запустите проект из исходной папки/комплекта Docker. Не удаляйте тома или старые установки до восстановления базы.</w:t>
             </w:r>
           </w:p>
         </w:tc>
@@ -2953,7 +2301,7 @@
               <w:rPr>
                 <w:sz w:val="18"/>
               </w:rPr>
-              <w:t>PID record does not match</w:t>
+              <w:t>Нужны журналы</w:t>
             </w:r>
           </w:p>
         </w:tc>
@@ -2969,44 +2317,7 @@
               <w:rPr>
                 <w:sz w:val="18"/>
               </w:rPr>
-              <w:t>Скрипт отказался останавливать процесс с неподтверждённой принадлежностью. Проверьте .runtime/windows-*.json и командную строку процесса; это возможно после перемещения папки</w:t>
-            </w:r>
-          </w:p>
-        </w:tc>
-      </w:tr>
-      <w:tr>
-        <w:trPr>
-          <w:cantSplit/>
-        </w:trPr>
-        <w:tc>
-          <w:tcPr>
-            <w:tcW w:type="dxa" w:w="3231"/>
-          </w:tcPr>
-          <w:p>
-            <w:pPr>
-              <w:spacing w:after="80" w:before="80"/>
-            </w:pPr>
-            <w:r>
-              <w:rPr>
-                <w:sz w:val="18"/>
-              </w:rPr>
-              <w:t>Интерфейс не открывается</w:t>
-            </w:r>
-          </w:p>
-        </w:tc>
-        <w:tc>
-          <w:tcPr>
-            <w:tcW w:type="dxa" w:w="6520"/>
-          </w:tcPr>
-          <w:p>
-            <w:pPr>
-              <w:spacing w:after="80" w:before="80"/>
-            </w:pPr>
-            <w:r>
-              <w:rPr>
-                <w:sz w:val="18"/>
-              </w:rPr>
-              <w:t>Дождитесь готовности сервисов, проверьте localhost и /health, затем логи</w:t>
+              <w:t>При ошибке старта окно автоматически показывает состояние Compose и последние журналы. Также откройте Docker Desktop → Containers → testpilot → Logs.</w:t>
             </w:r>
           </w:p>
         </w:tc>
@@ -3019,86 +2330,18 @@
     </w:p>
     <w:p>
       <w:r>
-        <w:t>Для проверки web-сервиса:</w:t>
+        <w:t>При обращении за помощью приложите сообщение из окна запуска и номер шага. Не прикладывайте `.env`, пароли или API-ключи. Проверьте журналы на отсутствие секретов и персональных данных.</w:t>
       </w:r>
     </w:p>
     <w:p>
-      <w:pPr>
-        <w:keepLines/>
-        <w:spacing w:line="252" w:lineRule="auto" w:before="60" w:after="180"/>
-        <w:ind w:left="85" w:right="57"/>
-        <w:shd w:fill="EDF2F8"/>
-      </w:pPr>
-      <w:r>
-        <w:rPr>
-          <w:rFonts w:ascii="Consolas" w:hAnsi="Consolas"/>
-          <w:color w:val="17365D"/>
-          <w:sz w:val="17"/>
-        </w:rPr>
-        <w:t>Invoke-RestMethod http://127.0.0.1:8000/health</w:t>
-      </w:r>
-    </w:p>
-    <w:p>
-      <w:r>
-        <w:t>Посмотреть последние ошибки web-приложения:</w:t>
-      </w:r>
-    </w:p>
-    <w:p>
-      <w:pPr>
-        <w:keepLines/>
-        <w:spacing w:line="252" w:lineRule="auto" w:before="60" w:after="180"/>
-        <w:ind w:left="85" w:right="57"/>
-        <w:shd w:fill="EDF2F8"/>
-      </w:pPr>
-      <w:r>
-        <w:rPr>
-          <w:rFonts w:ascii="Consolas" w:hAnsi="Consolas"/>
-          <w:color w:val="17365D"/>
-          <w:sz w:val="17"/>
-        </w:rPr>
-        <w:t>Get-Content .runtime\windows-web.error.log -Tail 50</w:t>
-      </w:r>
-    </w:p>
-    <w:p>
-      <w:r>
-        <w:t>Посмотреть логи базы:</w:t>
-      </w:r>
-    </w:p>
-    <w:p>
-      <w:pPr>
-        <w:keepLines/>
-        <w:spacing w:line="252" w:lineRule="auto" w:before="60" w:after="180"/>
-        <w:ind w:left="85" w:right="57"/>
-        <w:shd w:fill="EDF2F8"/>
-      </w:pPr>
-      <w:r>
-        <w:rPr>
-          <w:rFonts w:ascii="Consolas" w:hAnsi="Consolas"/>
-          <w:color w:val="17365D"/>
-          <w:sz w:val="17"/>
-        </w:rPr>
-        <w:t>docker compose logs --tail=50 db</w:t>
-      </w:r>
-    </w:p>
-    <w:p>
-      <w:r>
-        <w:t>В папке .runtime также находятся windows-impact.log, windows-impact.error.log, windows-intelligence.log, windows-intelligence.error.log и windows-web.log.</w:t>
-      </w:r>
-    </w:p>
-    <w:p>
-      <w:r>
-        <w:t>При обращении за помощью приложите текст ошибки, команду и номер шага, на котором она возникла. Не прикладывайте .env, пароли и API-ключи. Перед пересылкой логов проверьте отсутствие секретов и персональных данных. Не публикуйте локальный сервис в интернет для обхода ошибки соединения.</w:t>
-      </w:r>
-    </w:p>
-    <w:p>
-      <w:bookmarkStart w:id="15" w:name="section_15"/>
+      <w:bookmarkStart w:id="11" w:name="section_11"/>
       <w:pPr>
         <w:pStyle w:val="Heading1"/>
       </w:pPr>
       <w:r>
         <w:t>Контрольный список перед передачей или показом</w:t>
       </w:r>
-      <w:bookmarkEnd w:id="15"/>
+      <w:bookmarkEnd w:id="11"/>
     </w:p>
     <w:p>
       <w:pPr>
@@ -3113,7 +2356,7 @@
         <w:pStyle w:val="ListBullet"/>
       </w:pPr>
       <w:r>
-        <w:t>Установщик завершился без ошибки; start.ps1 сообщил Ready.</w:t>
+        <w:t>Run-TestPilot.bat сообщил Ready и открыл браузер.</w:t>
       </w:r>
     </w:p>
     <w:p>
@@ -3137,7 +2380,7 @@
         <w:pStyle w:val="ListBullet"/>
       </w:pPr>
       <w:r>
-        <w:t>Файл .env закрыт и не попадает в демонстрацию экрана.</w:t>
+        <w:t>Если вы создавали .env, он закрыт и не попадает в демонстрацию экрана.</w:t>
       </w:r>
     </w:p>
     <w:p>
@@ -3153,32 +2396,32 @@
         <w:pStyle w:val="ListBullet"/>
       </w:pPr>
       <w:r>
-        <w:t>Известна команда остановки: .\scripts\stop.ps1 -Database.</w:t>
+        <w:t>Известен остановочный файл Stop-TestPilot.bat.</w:t>
       </w:r>
     </w:p>
     <w:p>
-      <w:bookmarkStart w:id="16" w:name="section_16"/>
+      <w:bookmarkStart w:id="12" w:name="section_12"/>
       <w:pPr>
         <w:pStyle w:val="Heading1"/>
       </w:pPr>
       <w:r>
         <w:t>Проверенная база и границы руководства</w:t>
       </w:r>
-      <w:bookmarkEnd w:id="16"/>
+      <w:bookmarkEnd w:id="12"/>
     </w:p>
     <w:p>
       <w:r>
-        <w:t>В облачном Linux прошли 84 pytest с PostgreSQL, сквозные HTTP/Playwright-сценарии и проверка сохранения данных после перезапуска. На PowerShell 7.4.19 для Linux проверены синтаксис скриптов, чтение .env как данных, коды ошибок, пути с пробелами и защита от остановки чужого/повторно использованного PID с контрольными объектами.</w:t>
+        <w:t>В облачном Linux прошли 84 pytest с PostgreSQL, сквозной HTTP/Playwright-сценарий и проверка сохранения данных после перезапуска. Compose-конфигурация прошла проверку. Попытка сборки в этой облачной среде остановилась из-за отсутствия DNS доступа из Docker build к package index; полный запуск на Windows Docker Desktop здесь не выполнялся.</w:t>
       </w:r>
     </w:p>
     <w:p>
       <w:r>
-        <w:t>Это не заменяет полный запуск Windows: Docker Desktop, настоящий Win32_Process, NTFS и Windows Chromium в облачной проверке недоступны. Windows PowerShell 5.1 отдельно не запускался. Успешная установка на реальном Windows пока не заявляется.</w:t>
+        <w:t>PowerShell-оболочка запускает весь стек и открывает браузер одним двойным щелчком; требуется только заранее установленный Docker Desktop. На этой среде проверен синтаксис Compose, но не установка Docker Desktop на физическом Windows. Настоящая 1С/OData и разбор бинарных выгрузок не подключены.</w:t>
       </w:r>
     </w:p>
     <w:p>
       <w:r>
-        <w:t>Приложение рассчитано на локальную демонстрацию с общими ролями, а не на публичную промышленную многопользовательскую эксплуатацию.</w:t>
+        <w:t>Приложение предназначено для локальной демонстрации и не настроено как публичная многопользовательская служба.</w:t>
       </w:r>
     </w:p>
     <w:p>
@@ -3208,9 +2451,9 @@
         <w:pStyle w:val="ListBullet"/>
       </w:pPr>
       <w:r>
-        <w:t xml:space="preserve">Актуальная Windows-инструкция: </w:t>
+        <w:t xml:space="preserve">Полная установка: </w:t>
       </w:r>
-      <w:hyperlink r:id="rId16">
+      <w:hyperlink r:id="rId14">
         <w:r>
           <w:rPr>
             <w:color w:val="2457B7"/>
@@ -3227,7 +2470,7 @@
       <w:r>
         <w:t xml:space="preserve">Сценарий показа: </w:t>
       </w:r>
-      <w:hyperlink r:id="rId17">
+      <w:hyperlink r:id="rId15">
         <w:r>
           <w:rPr>
             <w:color w:val="2457B7"/>
@@ -3278,7 +2521,7 @@
       <w:rPr>
         <w:sz w:val="16"/>
       </w:rPr>
-      <w:t>TestPilot 1C  •  Руководство пользователя  •  Windows / PowerShell</w:t>
+      <w:t>TestPilot 1C  •  Руководство пользователя  •  Docker Desktop</w:t>
     </w:r>
   </w:p>
 </w:hdr>

</xml_diff>